<commit_message>
docs: corrected folder name in cd commands
</commit_message>
<xml_diff>
--- a/reports/report.docx
+++ b/reports/report.docx
@@ -23,6 +23,11 @@
       </w:r>
     </w:p>
     <w:p>
+      <w:pPr>
+        <w:tabs>
+          <w:tab w:val="left" w:pos="5640"/>
+        </w:tabs>
+      </w:pPr>
       <w:r>
         <w:rPr>
           <w:sz w:val="20"/>
@@ -33,9 +38,38 @@
         <w:rPr>
           <w:sz w:val="20"/>
         </w:rPr>
+        <w:tab/>
+      </w:r>
+      <w:r>
+        <w:rPr>
+          <w:sz w:val="20"/>
+        </w:rPr>
         <w:br/>
-        <w:t>Repository: &lt;https://github.com/tancred27/mlops-assignment&gt;</w:t>
+        <w:t xml:space="preserve">Repository: </w:t>
       </w:r>
+      <w:hyperlink r:id="rId8" w:history="1">
+        <w:r>
+          <w:rPr>
+            <w:rStyle w:val="Hyperlink"/>
+            <w:sz w:val="20"/>
+          </w:rPr>
+          <w:t>Gith</w:t>
+        </w:r>
+        <w:r>
+          <w:rPr>
+            <w:rStyle w:val="Hyperlink"/>
+            <w:sz w:val="20"/>
+          </w:rPr>
+          <w:t>u</w:t>
+        </w:r>
+        <w:r>
+          <w:rPr>
+            <w:rStyle w:val="Hyperlink"/>
+            <w:sz w:val="20"/>
+          </w:rPr>
+          <w:t>b Link</w:t>
+        </w:r>
+      </w:hyperlink>
       <w:r>
         <w:rPr>
           <w:sz w:val="20"/>
@@ -377,7 +411,7 @@
                     <pic:cNvPicPr/>
                   </pic:nvPicPr>
                   <pic:blipFill>
-                    <a:blip r:embed="rId8"/>
+                    <a:blip r:embed="rId9"/>
                     <a:stretch>
                       <a:fillRect/>
                     </a:stretch>
@@ -445,7 +479,14 @@
           <w:rFonts w:ascii="Consolas" w:hAnsi="Consolas"/>
           <w:sz w:val="17"/>
         </w:rPr>
-        <w:t>cd heart-disease-mlops</w:t>
+        <w:t xml:space="preserve">cd </w:t>
+      </w:r>
+      <w:r>
+        <w:rPr>
+          <w:rFonts w:ascii="Consolas" w:hAnsi="Consolas"/>
+          <w:sz w:val="17"/>
+        </w:rPr>
+        <w:t>mlops-assignment</w:t>
       </w:r>
     </w:p>
     <w:p>
@@ -1559,7 +1600,7 @@
                     <pic:cNvPicPr/>
                   </pic:nvPicPr>
                   <pic:blipFill>
-                    <a:blip r:embed="rId9"/>
+                    <a:blip r:embed="rId10"/>
                     <a:stretch>
                       <a:fillRect/>
                     </a:stretch>
@@ -1614,7 +1655,7 @@
                     <pic:cNvPicPr/>
                   </pic:nvPicPr>
                   <pic:blipFill>
-                    <a:blip r:embed="rId10"/>
+                    <a:blip r:embed="rId11"/>
                     <a:stretch>
                       <a:fillRect/>
                     </a:stretch>
@@ -1669,7 +1710,7 @@
                     <pic:cNvPicPr/>
                   </pic:nvPicPr>
                   <pic:blipFill>
-                    <a:blip r:embed="rId11"/>
+                    <a:blip r:embed="rId12"/>
                     <a:stretch>
                       <a:fillRect/>
                     </a:stretch>
@@ -2082,7 +2123,7 @@
                     <pic:cNvPicPr/>
                   </pic:nvPicPr>
                   <pic:blipFill>
-                    <a:blip r:embed="rId12"/>
+                    <a:blip r:embed="rId13"/>
                     <a:stretch>
                       <a:fillRect/>
                     </a:stretch>
@@ -2137,7 +2178,7 @@
                     <pic:cNvPicPr/>
                   </pic:nvPicPr>
                   <pic:blipFill>
-                    <a:blip r:embed="rId13"/>
+                    <a:blip r:embed="rId14"/>
                     <a:stretch>
                       <a:fillRect/>
                     </a:stretch>
@@ -3587,7 +3628,7 @@
                     <pic:cNvPicPr/>
                   </pic:nvPicPr>
                   <pic:blipFill>
-                    <a:blip r:embed="rId14"/>
+                    <a:blip r:embed="rId15"/>
                     <a:stretch>
                       <a:fillRect/>
                     </a:stretch>
@@ -3642,7 +3683,7 @@
                     <pic:cNvPicPr/>
                   </pic:nvPicPr>
                   <pic:blipFill>
-                    <a:blip r:embed="rId15"/>
+                    <a:blip r:embed="rId16"/>
                     <a:stretch>
                       <a:fillRect/>
                     </a:stretch>
@@ -3697,7 +3738,7 @@
                     <pic:cNvPicPr/>
                   </pic:nvPicPr>
                   <pic:blipFill>
-                    <a:blip r:embed="rId16"/>
+                    <a:blip r:embed="rId17"/>
                     <a:stretch>
                       <a:fillRect/>
                     </a:stretch>
@@ -3752,7 +3793,7 @@
                     <pic:cNvPicPr/>
                   </pic:nvPicPr>
                   <pic:blipFill>
-                    <a:blip r:embed="rId17"/>
+                    <a:blip r:embed="rId18"/>
                     <a:stretch>
                       <a:fillRect/>
                     </a:stretch>
@@ -4621,6 +4662,7 @@
       </w:tr>
       <w:tr>
         <w:trPr>
+          <w:trHeight w:val="390"/>
           <w:jc w:val="center"/>
         </w:trPr>
         <w:tc>
@@ -4891,7 +4933,7 @@
                           <pic:cNvPicPr/>
                         </pic:nvPicPr>
                         <pic:blipFill>
-                          <a:blip r:embed="rId18"/>
+                          <a:blip r:embed="rId19"/>
                           <a:stretch>
                             <a:fillRect/>
                           </a:stretch>
@@ -4950,7 +4992,7 @@
                           <pic:cNvPicPr/>
                         </pic:nvPicPr>
                         <pic:blipFill>
-                          <a:blip r:embed="rId19"/>
+                          <a:blip r:embed="rId20"/>
                           <a:stretch>
                             <a:fillRect/>
                           </a:stretch>
@@ -5014,7 +5056,7 @@
                           <pic:cNvPicPr/>
                         </pic:nvPicPr>
                         <pic:blipFill>
-                          <a:blip r:embed="rId20"/>
+                          <a:blip r:embed="rId21"/>
                           <a:stretch>
                             <a:fillRect/>
                           </a:stretch>
@@ -5073,7 +5115,7 @@
                           <pic:cNvPicPr/>
                         </pic:nvPicPr>
                         <pic:blipFill>
-                          <a:blip r:embed="rId21"/>
+                          <a:blip r:embed="rId22"/>
                           <a:stretch>
                             <a:fillRect/>
                           </a:stretch>
@@ -5480,7 +5522,7 @@
                           <pic:cNvPicPr/>
                         </pic:nvPicPr>
                         <pic:blipFill>
-                          <a:blip r:embed="rId22"/>
+                          <a:blip r:embed="rId23"/>
                           <a:stretch>
                             <a:fillRect/>
                           </a:stretch>
@@ -5539,7 +5581,7 @@
                           <pic:cNvPicPr/>
                         </pic:nvPicPr>
                         <pic:blipFill>
-                          <a:blip r:embed="rId23"/>
+                          <a:blip r:embed="rId24"/>
                           <a:stretch>
                             <a:fillRect/>
                           </a:stretch>
@@ -5603,7 +5645,7 @@
                           <pic:cNvPicPr/>
                         </pic:nvPicPr>
                         <pic:blipFill>
-                          <a:blip r:embed="rId24"/>
+                          <a:blip r:embed="rId25"/>
                           <a:stretch>
                             <a:fillRect/>
                           </a:stretch>
@@ -6001,7 +6043,7 @@
                           <pic:cNvPicPr/>
                         </pic:nvPicPr>
                         <pic:blipFill>
-                          <a:blip r:embed="rId25"/>
+                          <a:blip r:embed="rId26"/>
                           <a:stretch>
                             <a:fillRect/>
                           </a:stretch>
@@ -6060,7 +6102,7 @@
                           <pic:cNvPicPr/>
                         </pic:nvPicPr>
                         <pic:blipFill>
-                          <a:blip r:embed="rId26"/>
+                          <a:blip r:embed="rId27"/>
                           <a:stretch>
                             <a:fillRect/>
                           </a:stretch>
@@ -6125,7 +6167,7 @@
                           <pic:cNvPicPr/>
                         </pic:nvPicPr>
                         <pic:blipFill>
-                          <a:blip r:embed="rId27"/>
+                          <a:blip r:embed="rId28"/>
                           <a:stretch>
                             <a:fillRect/>
                           </a:stretch>
@@ -6566,7 +6608,7 @@
                     <pic:cNvPicPr/>
                   </pic:nvPicPr>
                   <pic:blipFill>
-                    <a:blip r:embed="rId28"/>
+                    <a:blip r:embed="rId29"/>
                     <a:stretch>
                       <a:fillRect/>
                     </a:stretch>
@@ -6622,7 +6664,7 @@
                     <pic:cNvPicPr/>
                   </pic:nvPicPr>
                   <pic:blipFill>
-                    <a:blip r:embed="rId29"/>
+                    <a:blip r:embed="rId30"/>
                     <a:stretch>
                       <a:fillRect/>
                     </a:stretch>
@@ -7591,7 +7633,7 @@
       </w:r>
     </w:p>
     <w:sectPr>
-      <w:footerReference w:type="default" r:id="rId30"/>
+      <w:footerReference w:type="default" r:id="rId31"/>
       <w:pgSz w:w="11906" w:h="16838"/>
       <w:pgMar w:top="1134" w:right="1247" w:bottom="1134" w:left="1247" w:header="720" w:footer="720" w:gutter="0"/>
       <w:cols w:space="720"/>
@@ -19261,6 +19303,41 @@
       </w:tcPr>
     </w:tblStylePr>
   </w:style>
+  <w:style w:type="character" w:styleId="Hyperlink">
+    <w:name w:val="Hyperlink"/>
+    <w:basedOn w:val="DefaultParagraphFont"/>
+    <w:uiPriority w:val="99"/>
+    <w:unhideWhenUsed/>
+    <w:rsid w:val="00D20E8F"/>
+    <w:rPr>
+      <w:color w:val="0000FF" w:themeColor="hyperlink"/>
+      <w:u w:val="single"/>
+    </w:rPr>
+  </w:style>
+  <w:style w:type="character" w:styleId="UnresolvedMention">
+    <w:name w:val="Unresolved Mention"/>
+    <w:basedOn w:val="DefaultParagraphFont"/>
+    <w:uiPriority w:val="99"/>
+    <w:semiHidden/>
+    <w:unhideWhenUsed/>
+    <w:rsid w:val="00D20E8F"/>
+    <w:rPr>
+      <w:color w:val="605E5C"/>
+      <w:shd w:val="clear" w:color="auto" w:fill="E1DFDD"/>
+    </w:rPr>
+  </w:style>
+  <w:style w:type="character" w:styleId="FollowedHyperlink">
+    <w:name w:val="FollowedHyperlink"/>
+    <w:basedOn w:val="DefaultParagraphFont"/>
+    <w:uiPriority w:val="99"/>
+    <w:semiHidden/>
+    <w:unhideWhenUsed/>
+    <w:rsid w:val="00D20E8F"/>
+    <w:rPr>
+      <w:color w:val="800080" w:themeColor="followedHyperlink"/>
+      <w:u w:val="single"/>
+    </w:rPr>
+  </w:style>
 </w:styles>
 </file>
 

</xml_diff>